<commit_message>
Guide commercial avec offre reelle ANDRAGOPS (SST, PRAP, incendie, cohesion)
Integration du catalogue reel : SST, MAC SST, gestes et postures, PRAP IBC,
incendie, cohesion d'entreprise. Angle securite reglementaire + sur-mesure local.

Co-Authored-By: Claude Opus 4.8 (1M context) <noreply@anthropic.com>
Claude-Session: https://claude.ai/code/session_01DWZPNPELyEGAgNuApAT9EL
</commit_message>
<xml_diff>
--- a/Guide_RDV_Commercial_COUSIN_GROUP.docx
+++ b/Guide_RDV_Commercial_COUSIN_GROUP.docx
@@ -64,7 +64,7 @@
           <w:color w:val="444444"/>
           <w:sz w:val="22"/>
         </w:rPr>
-        <w:t>Objectif : présenter nos formations &amp; identifier les besoins des équipes</w:t>
+        <w:t>Formations prévention &amp; santé-sécurité au travail + cohésion d'équipe</w:t>
       </w:r>
     </w:p>
     <w:p>
@@ -139,7 +139,7 @@
         <w:rPr>
           <w:b w:val="0"/>
         </w:rPr>
-        <w:t>Ce n'est pas un argumentaire « descendant ». C'est un échange de découverte : on présente brièvement ANDRAGOPS, puis on fait parler la RH pour cerner les besoins réels des équipes, et on co-construit une piste de formation sur-mesure.</w:t>
+        <w:t>Échange de découverte : présenter brièvement ANDRAGOPS, faire parler la RH sur leurs enjeux sécurité / prévention / cohésion, puis proposer une piste sur-mesure. La sécurité au travail est en grande partie une obligation réglementaire : c'est un levier de vente puissant.</w:t>
       </w:r>
     </w:p>
     <w:tbl>
@@ -156,14 +156,44 @@
       <w:tr>
         <w:tc>
           <w:tcPr>
-            <w:tcW w:type="dxa" w:w="3312"/>
+            <w:tcW w:type="dxa" w:w="2880"/>
           </w:tcPr>
           <w:p>
             <w:r>
               <w:rPr>
                 <w:b/>
                 <w:color w:val="1F3A5F"/>
-                <w:sz w:val="21"/>
+                <w:sz w:val="20"/>
+              </w:rPr>
+              <w:t>Élément</w:t>
+            </w:r>
+          </w:p>
+        </w:tc>
+        <w:tc>
+          <w:tcPr>
+            <w:tcW w:type="dxa" w:w="6192"/>
+          </w:tcPr>
+          <w:p>
+            <w:r>
+              <w:rPr>
+                <w:b/>
+                <w:color w:val="1F3A5F"/>
+                <w:sz w:val="20"/>
+              </w:rPr>
+              <w:t>Repère</w:t>
+            </w:r>
+          </w:p>
+        </w:tc>
+      </w:tr>
+      <w:tr>
+        <w:tc>
+          <w:tcPr>
+            <w:tcW w:type="dxa" w:w="2880"/>
+          </w:tcPr>
+          <w:p>
+            <w:r>
+              <w:rPr>
+                <w:sz w:val="19"/>
               </w:rPr>
               <w:t>But de l'appel</w:t>
             </w:r>
@@ -171,14 +201,14 @@
         </w:tc>
         <w:tc>
           <w:tcPr>
-            <w:tcW w:type="dxa" w:w="5760"/>
+            <w:tcW w:type="dxa" w:w="6192"/>
           </w:tcPr>
           <w:p>
             <w:r>
               <w:rPr>
-                <w:sz w:val="21"/>
+                <w:sz w:val="19"/>
               </w:rPr>
-              <w:t>Créer le lien, qualifier les besoins, décrocher un rendez-vous de cadrage</w:t>
+              <w:t>Qualifier les besoins SST/prévention, décrocher un RDV de cadrage</w:t>
             </w:r>
           </w:p>
         </w:tc>
@@ -186,14 +216,12 @@
       <w:tr>
         <w:tc>
           <w:tcPr>
-            <w:tcW w:type="dxa" w:w="3312"/>
+            <w:tcW w:type="dxa" w:w="2880"/>
           </w:tcPr>
           <w:p>
             <w:r>
               <w:rPr>
-                <w:b/>
-                <w:color w:val="1F3A5F"/>
-                <w:sz w:val="21"/>
+                <w:sz w:val="19"/>
               </w:rPr>
               <w:t>Ce que je vends</w:t>
             </w:r>
@@ -201,14 +229,14 @@
         </w:tc>
         <w:tc>
           <w:tcPr>
-            <w:tcW w:type="dxa" w:w="5760"/>
+            <w:tcW w:type="dxa" w:w="6192"/>
           </w:tcPr>
           <w:p>
             <w:r>
               <w:rPr>
-                <w:sz w:val="21"/>
+                <w:sz w:val="19"/>
               </w:rPr>
-              <w:t>Des formations sur-mesure, ancrées localement, adaptées à leurs équipes</w:t>
+              <w:t>Formations sécurité obligatoires/recommandées + cohésion, en sur-mesure et local</w:t>
             </w:r>
           </w:p>
         </w:tc>
@@ -216,14 +244,12 @@
       <w:tr>
         <w:tc>
           <w:tcPr>
-            <w:tcW w:type="dxa" w:w="3312"/>
+            <w:tcW w:type="dxa" w:w="2880"/>
           </w:tcPr>
           <w:p>
             <w:r>
               <w:rPr>
-                <w:b/>
-                <w:color w:val="1F3A5F"/>
-                <w:sz w:val="21"/>
+                <w:sz w:val="19"/>
               </w:rPr>
               <w:t>Posture</w:t>
             </w:r>
@@ -231,14 +257,14 @@
         </w:tc>
         <w:tc>
           <w:tcPr>
-            <w:tcW w:type="dxa" w:w="5760"/>
+            <w:tcW w:type="dxa" w:w="6192"/>
           </w:tcPr>
           <w:p>
             <w:r>
               <w:rPr>
-                <w:sz w:val="21"/>
+                <w:sz w:val="19"/>
               </w:rPr>
-              <w:t>Expert-conseil à l'écoute (80 % écoute / 20 % parole), pas de monologue</w:t>
+              <w:t>Expert-conseil prévention (80 % écoute / 20 % parole)</w:t>
             </w:r>
           </w:p>
         </w:tc>
@@ -246,14 +272,12 @@
       <w:tr>
         <w:tc>
           <w:tcPr>
-            <w:tcW w:type="dxa" w:w="3312"/>
+            <w:tcW w:type="dxa" w:w="2880"/>
           </w:tcPr>
           <w:p>
             <w:r>
               <w:rPr>
-                <w:b/>
-                <w:color w:val="1F3A5F"/>
-                <w:sz w:val="21"/>
+                <w:sz w:val="19"/>
               </w:rPr>
               <w:t>Résultat visé</w:t>
             </w:r>
@@ -261,28 +285,20 @@
         </w:tc>
         <w:tc>
           <w:tcPr>
-            <w:tcW w:type="dxa" w:w="5760"/>
+            <w:tcW w:type="dxa" w:w="6192"/>
           </w:tcPr>
           <w:p>
             <w:r>
               <w:rPr>
-                <w:sz w:val="21"/>
+                <w:sz w:val="19"/>
               </w:rPr>
-              <w:t>Un prochain RDV (audit des besoins / proposition) + un contact identifié</w:t>
+              <w:t>Un audit de leurs besoins sécurité + une proposition chiffrée</w:t>
             </w:r>
           </w:p>
         </w:tc>
       </w:tr>
     </w:tbl>
     <w:p/>
-    <w:p>
-      <w:r>
-        <w:rPr>
-          <w:b w:val="0"/>
-        </w:rPr>
-        <w:t>Règle d'or : la RH doit parler plus que moi. Mon rôle = poser les bonnes questions et reformuler leurs besoins en solutions.</w:t>
-      </w:r>
-    </w:p>
     <w:p>
       <w:pPr>
         <w:pBdr>
@@ -295,264 +311,322 @@
           <w:color w:val="1F3A5F"/>
           <w:sz w:val="32"/>
         </w:rPr>
-        <w:t>2. Le prospect en 30 secondes (rappel)</w:t>
+        <w:t>2. Votre catalogue ANDRAGOPS (à présenter clairement)</w:t>
       </w:r>
     </w:p>
-    <w:p>
-      <w:pPr>
-        <w:pStyle w:val="ListBullet"/>
-      </w:pPr>
-      <w:r/>
-      <w:r>
-        <w:rPr>
-          <w:b/>
-        </w:rPr>
-        <w:t>COUSIN GROUP</w:t>
-      </w:r>
-      <w:r>
-        <w:t xml:space="preserve"> — groupe industriel familial de Wervicq-Sud (59), fondé en </w:t>
-      </w:r>
-      <w:r>
-        <w:rPr>
-          <w:b/>
-        </w:rPr>
-        <w:t>1848</w:t>
-      </w:r>
-      <w:r>
-        <w:t>.</w:t>
-      </w:r>
-    </w:p>
-    <w:p>
-      <w:pPr>
-        <w:pStyle w:val="ListBullet"/>
-      </w:pPr>
-      <w:r>
-        <w:t xml:space="preserve">3 pôles : </w:t>
-      </w:r>
-      <w:r>
-        <w:rPr>
-          <w:b/>
-        </w:rPr>
-        <w:t>Cousin Trestec</w:t>
-      </w:r>
-      <w:r>
-        <w:t xml:space="preserve"> (cordages techniques), </w:t>
-      </w:r>
-      <w:r>
-        <w:rPr>
-          <w:b/>
-        </w:rPr>
-        <w:t>Cousin Composites</w:t>
-      </w:r>
-      <w:r>
-        <w:t xml:space="preserve"> (joncs/profilés), </w:t>
-      </w:r>
-      <w:r>
-        <w:rPr>
-          <w:b/>
-        </w:rPr>
-        <w:t>Cousin Surgery</w:t>
-      </w:r>
-      <w:r>
-        <w:t xml:space="preserve"> (implants médicaux).</w:t>
-      </w:r>
-    </w:p>
-    <w:p>
-      <w:pPr>
-        <w:pStyle w:val="ListBullet"/>
-      </w:pPr>
-      <w:r>
-        <w:t xml:space="preserve">≈ </w:t>
-      </w:r>
-      <w:r>
-        <w:rPr>
-          <w:b/>
-        </w:rPr>
-        <w:t>150 collaborateurs</w:t>
-      </w:r>
-      <w:r>
-        <w:t xml:space="preserve"> ; valeurs affichées : </w:t>
-      </w:r>
-      <w:r>
-        <w:rPr>
-          <w:b/>
-        </w:rPr>
-        <w:t>exigence, qualité, innovation</w:t>
-      </w:r>
-      <w:r>
-        <w:t xml:space="preserve"> (~5 % du CA en R&amp;D).</w:t>
-      </w:r>
-    </w:p>
-    <w:p>
-      <w:pPr>
-        <w:pStyle w:val="ListBullet"/>
-      </w:pPr>
-      <w:r/>
-      <w:r>
-        <w:rPr>
-          <w:b/>
-        </w:rPr>
-        <w:t>175 ans de savoir-faire</w:t>
-      </w:r>
-      <w:r>
-        <w:t xml:space="preserve"> dans la transformation des fibres → fort enjeu de transmission.</w:t>
-      </w:r>
-    </w:p>
-    <w:p>
-      <w:pPr>
-        <w:pStyle w:val="ListBullet"/>
-      </w:pPr>
-      <w:r>
-        <w:t>Recrute des profils de production/encadrement (managers de production, responsables atelier, qualité, IT).</w:t>
-      </w:r>
-    </w:p>
-    <w:p>
-      <w:pPr>
-        <w:pBdr>
-          <w:bottom w:val="single" w:sz="6" w:space="4" w:color="B31B1B"/>
-        </w:pBdr>
-      </w:pPr>
-      <w:r>
-        <w:rPr>
-          <w:b/>
-          <w:color w:val="1F3A5F"/>
-          <w:sz w:val="32"/>
-        </w:rPr>
-        <w:t>3. Besoins probables → pistes de formation (à valider en RDV)</w:t>
-      </w:r>
-    </w:p>
+    <w:tbl>
+      <w:tblPr>
+        <w:tblStyle w:val="LightGrid-Accent1"/>
+        <w:tblW w:type="auto" w:w="0"/>
+        <w:jc w:val="left"/>
+        <w:tblLook w:firstColumn="1" w:firstRow="1" w:lastColumn="0" w:lastRow="0" w:noHBand="0" w:noVBand="1" w:val="04A0"/>
+      </w:tblPr>
+      <w:tblGrid>
+        <w:gridCol w:w="2880"/>
+        <w:gridCol w:w="2880"/>
+        <w:gridCol w:w="2880"/>
+      </w:tblGrid>
+      <w:tr>
+        <w:tc>
+          <w:tcPr>
+            <w:tcW w:type="dxa" w:w="2448"/>
+          </w:tcPr>
+          <w:p>
+            <w:r>
+              <w:rPr>
+                <w:b/>
+                <w:color w:val="1F3A5F"/>
+                <w:sz w:val="20"/>
+              </w:rPr>
+              <w:t>Formation</w:t>
+            </w:r>
+          </w:p>
+        </w:tc>
+        <w:tc>
+          <w:tcPr>
+            <w:tcW w:type="dxa" w:w="3600"/>
+          </w:tcPr>
+          <w:p>
+            <w:r>
+              <w:rPr>
+                <w:b/>
+                <w:color w:val="1F3A5F"/>
+                <w:sz w:val="20"/>
+              </w:rPr>
+              <w:t>À quoi ça sert</w:t>
+            </w:r>
+          </w:p>
+        </w:tc>
+        <w:tc>
+          <w:tcPr>
+            <w:tcW w:type="dxa" w:w="3024"/>
+          </w:tcPr>
+          <w:p>
+            <w:r>
+              <w:rPr>
+                <w:b/>
+                <w:color w:val="1F3A5F"/>
+                <w:sz w:val="20"/>
+              </w:rPr>
+              <w:t>Récurrence / cible</w:t>
+            </w:r>
+          </w:p>
+        </w:tc>
+      </w:tr>
+      <w:tr>
+        <w:tc>
+          <w:tcPr>
+            <w:tcW w:type="dxa" w:w="2448"/>
+          </w:tcPr>
+          <w:p>
+            <w:r>
+              <w:rPr>
+                <w:sz w:val="19"/>
+              </w:rPr>
+              <w:t>SST — Sauveteur Secouriste du Travail</w:t>
+            </w:r>
+          </w:p>
+        </w:tc>
+        <w:tc>
+          <w:tcPr>
+            <w:tcW w:type="dxa" w:w="3600"/>
+          </w:tcPr>
+          <w:p>
+            <w:r>
+              <w:rPr>
+                <w:sz w:val="19"/>
+              </w:rPr>
+              <w:t>Former des salariés à porter secours et à prévenir les risques</w:t>
+            </w:r>
+          </w:p>
+        </w:tc>
+        <w:tc>
+          <w:tcPr>
+            <w:tcW w:type="dxa" w:w="3024"/>
+          </w:tcPr>
+          <w:p>
+            <w:r>
+              <w:rPr>
+                <w:sz w:val="19"/>
+              </w:rPr>
+              <w:t>Initiale (~14 h). Cible : ouvriers atelier, encadrants</w:t>
+            </w:r>
+          </w:p>
+        </w:tc>
+      </w:tr>
+      <w:tr>
+        <w:tc>
+          <w:tcPr>
+            <w:tcW w:type="dxa" w:w="2448"/>
+          </w:tcPr>
+          <w:p>
+            <w:r>
+              <w:rPr>
+                <w:sz w:val="19"/>
+              </w:rPr>
+              <w:t>MAC SST (recyclage)</w:t>
+            </w:r>
+          </w:p>
+        </w:tc>
+        <w:tc>
+          <w:tcPr>
+            <w:tcW w:type="dxa" w:w="3600"/>
+          </w:tcPr>
+          <w:p>
+            <w:r>
+              <w:rPr>
+                <w:sz w:val="19"/>
+              </w:rPr>
+              <w:t>Maintien &amp; actualisation des compétences SST</w:t>
+            </w:r>
+          </w:p>
+        </w:tc>
+        <w:tc>
+          <w:tcPr>
+            <w:tcW w:type="dxa" w:w="3024"/>
+          </w:tcPr>
+          <w:p>
+            <w:r>
+              <w:rPr>
+                <w:sz w:val="19"/>
+              </w:rPr>
+              <w:t>Obligatoire tous les 24 mois → revenu récurrent</w:t>
+            </w:r>
+          </w:p>
+        </w:tc>
+      </w:tr>
+      <w:tr>
+        <w:tc>
+          <w:tcPr>
+            <w:tcW w:type="dxa" w:w="2448"/>
+          </w:tcPr>
+          <w:p>
+            <w:r>
+              <w:rPr>
+                <w:sz w:val="19"/>
+              </w:rPr>
+              <w:t>Gestes &amp; postures</w:t>
+            </w:r>
+          </w:p>
+        </w:tc>
+        <w:tc>
+          <w:tcPr>
+            <w:tcW w:type="dxa" w:w="3600"/>
+          </w:tcPr>
+          <w:p>
+            <w:r>
+              <w:rPr>
+                <w:sz w:val="19"/>
+              </w:rPr>
+              <w:t>Adopter les bons gestes pour éviter les blessures</w:t>
+            </w:r>
+          </w:p>
+        </w:tc>
+        <w:tc>
+          <w:tcPr>
+            <w:tcW w:type="dxa" w:w="3024"/>
+          </w:tcPr>
+          <w:p>
+            <w:r>
+              <w:rPr>
+                <w:sz w:val="19"/>
+              </w:rPr>
+              <w:t>Tout salarié manipulant des charges</w:t>
+            </w:r>
+          </w:p>
+        </w:tc>
+      </w:tr>
+      <w:tr>
+        <w:tc>
+          <w:tcPr>
+            <w:tcW w:type="dxa" w:w="2448"/>
+          </w:tcPr>
+          <w:p>
+            <w:r>
+              <w:rPr>
+                <w:sz w:val="19"/>
+              </w:rPr>
+              <w:t>PRAP IBC</w:t>
+            </w:r>
+          </w:p>
+        </w:tc>
+        <w:tc>
+          <w:tcPr>
+            <w:tcW w:type="dxa" w:w="3600"/>
+          </w:tcPr>
+          <w:p>
+            <w:r>
+              <w:rPr>
+                <w:sz w:val="19"/>
+              </w:rPr>
+              <w:t>Prévention des risques liés à l'activité physique (Industrie/BTP/Commerce)</w:t>
+            </w:r>
+          </w:p>
+        </w:tc>
+        <w:tc>
+          <w:tcPr>
+            <w:tcW w:type="dxa" w:w="3024"/>
+          </w:tcPr>
+          <w:p>
+            <w:r>
+              <w:rPr>
+                <w:sz w:val="19"/>
+              </w:rPr>
+              <w:t>Postes physiques, port de charges, TMS</w:t>
+            </w:r>
+          </w:p>
+        </w:tc>
+      </w:tr>
+      <w:tr>
+        <w:tc>
+          <w:tcPr>
+            <w:tcW w:type="dxa" w:w="2448"/>
+          </w:tcPr>
+          <w:p>
+            <w:r>
+              <w:rPr>
+                <w:sz w:val="19"/>
+              </w:rPr>
+              <w:t>Incendie</w:t>
+            </w:r>
+          </w:p>
+        </w:tc>
+        <w:tc>
+          <w:tcPr>
+            <w:tcW w:type="dxa" w:w="3600"/>
+          </w:tcPr>
+          <w:p>
+            <w:r>
+              <w:rPr>
+                <w:sz w:val="19"/>
+              </w:rPr>
+              <w:t>Manipulation extincteurs, évacuation, équipiers 1ʳᵉ intervention</w:t>
+            </w:r>
+          </w:p>
+        </w:tc>
+        <w:tc>
+          <w:tcPr>
+            <w:tcW w:type="dxa" w:w="3024"/>
+          </w:tcPr>
+          <w:p>
+            <w:r>
+              <w:rPr>
+                <w:sz w:val="19"/>
+              </w:rPr>
+              <w:t>Tout le site (exercices recommandés ~tous les 6 mois)</w:t>
+            </w:r>
+          </w:p>
+        </w:tc>
+      </w:tr>
+      <w:tr>
+        <w:tc>
+          <w:tcPr>
+            <w:tcW w:type="dxa" w:w="2448"/>
+          </w:tcPr>
+          <w:p>
+            <w:r>
+              <w:rPr>
+                <w:sz w:val="19"/>
+              </w:rPr>
+              <w:t>Cohésion d'entreprise</w:t>
+            </w:r>
+          </w:p>
+        </w:tc>
+        <w:tc>
+          <w:tcPr>
+            <w:tcW w:type="dxa" w:w="3600"/>
+          </w:tcPr>
+          <w:p>
+            <w:r>
+              <w:rPr>
+                <w:sz w:val="19"/>
+              </w:rPr>
+              <w:t>Activités de team building, renforcer le collectif</w:t>
+            </w:r>
+          </w:p>
+        </w:tc>
+        <w:tc>
+          <w:tcPr>
+            <w:tcW w:type="dxa" w:w="3024"/>
+          </w:tcPr>
+          <w:p>
+            <w:r>
+              <w:rPr>
+                <w:sz w:val="19"/>
+              </w:rPr>
+              <w:t>Équipes, managers, séminaires</w:t>
+            </w:r>
+          </w:p>
+        </w:tc>
+      </w:tr>
+    </w:tbl>
+    <w:p/>
     <w:p>
       <w:r>
         <w:rPr>
           <w:b w:val="0"/>
         </w:rPr>
-        <w:t>Hypothèses à confirmer par les questions de découverte. Ne pas les asséner : les amener sous forme de questions.</w:t>
-      </w:r>
-    </w:p>
-    <w:p>
-      <w:r>
-        <w:rPr>
-          <w:b/>
-          <w:color w:val="B31B1B"/>
-          <w:sz w:val="25"/>
-        </w:rPr>
-        <w:t>A. Transmission du savoir-faire (votre angle fort)</w:t>
-      </w:r>
-    </w:p>
-    <w:p>
-      <w:pPr>
-        <w:pStyle w:val="ListBullet"/>
-      </w:pPr>
-      <w:r>
-        <w:t>Enjeu : une maison de 175 ans = des experts métier dont le savoir doit se transmettre.</w:t>
-      </w:r>
-    </w:p>
-    <w:p>
-      <w:pPr>
-        <w:pStyle w:val="ListBullet"/>
-      </w:pPr>
-      <w:r>
-        <w:t xml:space="preserve">Pistes : </w:t>
-      </w:r>
-      <w:r>
-        <w:rPr>
-          <w:b/>
-        </w:rPr>
-        <w:t>formation de formateurs / tuteurs internes</w:t>
-      </w:r>
-      <w:r>
-        <w:t>, AFEST (formation en situation de travail), ingénierie de transmission, mentorat des nouveaux.</w:t>
-      </w:r>
-    </w:p>
-    <w:p>
-      <w:r>
-        <w:rPr>
-          <w:b/>
-          <w:color w:val="B31B1B"/>
-          <w:sz w:val="25"/>
-        </w:rPr>
-        <w:t>B. Management &amp; encadrement de proximité</w:t>
-      </w:r>
-    </w:p>
-    <w:p>
-      <w:pPr>
-        <w:pStyle w:val="ListBullet"/>
-      </w:pPr>
-      <w:r>
-        <w:t>Ils recrutent des managers de production / responsables d'atelier.</w:t>
-      </w:r>
-    </w:p>
-    <w:p>
-      <w:pPr>
-        <w:pStyle w:val="ListBullet"/>
-      </w:pPr>
-      <w:r>
-        <w:t>Pistes : management d'équipe, communication, gestion des conflits, conduite du changement, intégration des nouveaux managers.</w:t>
-      </w:r>
-    </w:p>
-    <w:p>
-      <w:r>
-        <w:rPr>
-          <w:b/>
-          <w:color w:val="B31B1B"/>
-          <w:sz w:val="25"/>
-        </w:rPr>
-        <w:t>C. IA &amp; outils numériques (productivité)</w:t>
-      </w:r>
-    </w:p>
-    <w:p>
-      <w:pPr>
-        <w:pStyle w:val="ListBullet"/>
-      </w:pPr>
-      <w:r>
-        <w:t>Une entreprise très orientée R&amp;D et innovation → gains possibles au bureau d'études, au commercial, à l'administratif.</w:t>
-      </w:r>
-    </w:p>
-    <w:p>
-      <w:pPr>
-        <w:pStyle w:val="ListBullet"/>
-      </w:pPr>
-      <w:r>
-        <w:t>Pistes : IA générative au quotidien, outils bureautiques avancés, digitalisation des process.</w:t>
-      </w:r>
-    </w:p>
-    <w:p>
-      <w:r>
-        <w:rPr>
-          <w:b/>
-          <w:color w:val="B31B1B"/>
-          <w:sz w:val="25"/>
-        </w:rPr>
-        <w:t>D. Qualité, sécurité &amp; compétences métier</w:t>
-      </w:r>
-    </w:p>
-    <w:p>
-      <w:pPr>
-        <w:pStyle w:val="ListBullet"/>
-      </w:pPr>
-      <w:r>
-        <w:t>Milieu industriel exigeant (et salle blanche côté médical).</w:t>
-      </w:r>
-    </w:p>
-    <w:p>
-      <w:pPr>
-        <w:pStyle w:val="ListBullet"/>
-      </w:pPr>
-      <w:r>
-        <w:t>Pistes : qualité, sécurité au poste, habilitations, montée en compétences techniques.</w:t>
-      </w:r>
-    </w:p>
-    <w:p>
-      <w:r>
-        <w:rPr>
-          <w:b w:val="0"/>
-        </w:rPr>
-        <w:t>→ Adaptez ces pistes à VOTRE catalogue ANDRAGOPS réel. Notez vos 2-3 offres phares ci-dessous :</w:t>
-      </w:r>
-    </w:p>
-    <w:p>
-      <w:r>
-        <w:t>……………………………………………………………………………………………………</w:t>
+        <w:t>→ Ajustez les durées/tarifs avec vos chiffres réels. Notez vos tarifs indicatifs ci-dessous :</w:t>
       </w:r>
     </w:p>
     <w:p>
@@ -577,7 +651,7 @@
           <w:color w:val="1F3A5F"/>
           <w:sz w:val="32"/>
         </w:rPr>
-        <w:t>4. Pitch ANDRAGOPS (30–60 secondes)</w:t>
+        <w:t>3. Pourquoi le COUSIN GROUP est un prospect idéal</w:t>
       </w:r>
     </w:p>
     <w:p>
@@ -585,7 +659,97 @@
         <w:rPr>
           <w:b w:val="0"/>
         </w:rPr>
-        <w:t>Trame à personnaliser avec vos mots :</w:t>
+        <w:t>Site industriel ~150 personnes (cordages, composites, médical) : manipulation de fibres et bobines, machines de tressage/câblage, port de charges, salle blanche côté médical. Beaucoup de besoins sécurité concrets et souvent réglementaires.</w:t>
+      </w:r>
+    </w:p>
+    <w:p>
+      <w:pPr>
+        <w:pStyle w:val="ListBullet"/>
+      </w:pPr>
+      <w:r/>
+      <w:r>
+        <w:rPr>
+          <w:b/>
+        </w:rPr>
+        <w:t>SST</w:t>
+      </w:r>
+      <w:r>
+        <w:t xml:space="preserve"> : il faut des secouristes formés dans chaque atelier (recommandation INRS/Assurance Maladie : au moins un SST par équipe / zone de travail).</w:t>
+      </w:r>
+    </w:p>
+    <w:p>
+      <w:pPr>
+        <w:pStyle w:val="ListBullet"/>
+      </w:pPr>
+      <w:r/>
+      <w:r>
+        <w:rPr>
+          <w:b/>
+        </w:rPr>
+        <w:t>MAC SST</w:t>
+      </w:r>
+      <w:r>
+        <w:t xml:space="preserve"> : tous leurs SST déjà formés doivent être recyclés tous les 2 ans → besoin récurrent.</w:t>
+      </w:r>
+    </w:p>
+    <w:p>
+      <w:pPr>
+        <w:pStyle w:val="ListBullet"/>
+      </w:pPr>
+      <w:r/>
+      <w:r>
+        <w:rPr>
+          <w:b/>
+        </w:rPr>
+        <w:t>Gestes &amp; postures / PRAP IBC</w:t>
+      </w:r>
+      <w:r>
+        <w:t xml:space="preserve"> : les TMS (troubles musculo-squelettiques) sont la 1ʳᵉ cause de maladies professionnelles dans l'industrie → enjeu santé + absentéisme + coût.</w:t>
+      </w:r>
+    </w:p>
+    <w:p>
+      <w:pPr>
+        <w:pStyle w:val="ListBullet"/>
+      </w:pPr>
+      <w:r/>
+      <w:r>
+        <w:rPr>
+          <w:b/>
+        </w:rPr>
+        <w:t>Incendie</w:t>
+      </w:r>
+      <w:r>
+        <w:t xml:space="preserve"> : obligation d'organiser des exercices d'évacuation et de former le personnel à la manipulation des extincteurs (Code du travail) ; matières et machines = risque réel.</w:t>
+      </w:r>
+    </w:p>
+    <w:p>
+      <w:pPr>
+        <w:pStyle w:val="ListBullet"/>
+      </w:pPr>
+      <w:r/>
+      <w:r>
+        <w:rPr>
+          <w:b/>
+        </w:rPr>
+        <w:t>Cohésion</w:t>
+      </w:r>
+      <w:r>
+        <w:t xml:space="preserve"> : une maison familiale de 175 ans, en croissance et qui recrute → fédérer anciens et nouveaux, renforcer l'esprit d'équipe.</w:t>
+      </w:r>
+    </w:p>
+    <w:p>
+      <w:pPr>
+        <w:pBdr>
+          <w:bottom w:val="single" w:sz="6" w:space="4" w:color="B31B1B"/>
+        </w:pBdr>
+      </w:pPr>
+      <w:r>
+        <w:rPr>
+          <w:b/>
+          <w:color w:val="1F3A5F"/>
+          <w:sz w:val="32"/>
+        </w:rPr>
+        <w:t>4. Pitch ANDRAGOPS (30–60 secondes)</w:t>
       </w:r>
     </w:p>
     <w:p>
@@ -600,7 +764,7 @@
         <w:rPr>
           <w:i/>
         </w:rPr>
-        <w:t>« Bonjour, [Prénom Nom], d'ANDRAGOPS Académie. Merci de prendre le temps. On accompagne les entreprises industrielles comme la vôtre sur la montée en compétences de leurs équipes. »</w:t>
+        <w:t>« Bonjour, [Prénom Nom], d'ANDRAGOPS Académie. Merci de me consacrer quelques minutes. On accompagne les entreprises industrielles sur la sécurité et la prévention des risques au travail. »</w:t>
       </w:r>
     </w:p>
     <w:p>
@@ -615,7 +779,7 @@
         <w:rPr>
           <w:i/>
         </w:rPr>
-        <w:t>« ANDRAGOPS, c'est un organisme de formation [Qualiopi le cas échéant], spécialisé dans des formations sur-mesure, conçues à partir de vos besoins réels, et de proximité. »</w:t>
+        <w:t>« Concrètement, on forme vos équipes au secourisme (SST), aux gestes et postures, à la PRAP, à l'incendie — et on propose aussi des activités de cohésion. Le tout en sur-mesure et en proximité, ici dans les Hauts-de-France. »</w:t>
       </w:r>
     </w:p>
     <w:p>
@@ -630,7 +794,7 @@
         <w:rPr>
           <w:i/>
         </w:rPr>
-        <w:t>« J'ai vu que Cousin est une maison de 175 ans, très attachée à la qualité et à l'innovation — c'est exactement le type d'entreprise pour qui le sur-mesure fait la différence. »</w:t>
+        <w:t>« Avec un site comme le vôtre, il y a forcément des obligations à tenir (secouristes, évacuation, prévention des TMS) — et c'est exactement notre métier. »</w:t>
       </w:r>
     </w:p>
     <w:p>
@@ -645,7 +809,7 @@
         <w:rPr>
           <w:i/>
         </w:rPr>
-        <w:t>« Avant de vous présenter ce qu'on fait, j'aimerais d'abord comprendre vos enjeux RH du moment. Je peux vous poser quelques questions ? »</w:t>
+        <w:t>« Avant de vous en dire plus, j'aimerais comprendre où vous en êtes aujourd'hui sur ces sujets. Je peux vous poser quelques questions ? »</w:t>
       </w:r>
     </w:p>
     <w:p>
@@ -683,15 +847,7 @@
           <w:color w:val="1F3A5F"/>
           <w:sz w:val="32"/>
         </w:rPr>
-        <w:t>5. Questions de découverte (le cœur de l'appel)</w:t>
-      </w:r>
-    </w:p>
-    <w:p>
-      <w:r>
-        <w:rPr>
-          <w:b w:val="0"/>
-        </w:rPr>
-        <w:t>Méthode : Situation → Besoins → Impact → Décision. Laissez des silences, notez tout.</w:t>
+        <w:t>5. Questions de découverte (faire parler la RH)</w:t>
       </w:r>
     </w:p>
     <w:p>
@@ -701,7 +857,7 @@
           <w:color w:val="B31B1B"/>
           <w:sz w:val="25"/>
         </w:rPr>
-        <w:t>Situation / contexte</w:t>
+        <w:t>Secourisme / SST</w:t>
       </w:r>
     </w:p>
     <w:p>
@@ -709,7 +865,7 @@
         <w:pStyle w:val="ListBullet"/>
       </w:pPr>
       <w:r>
-        <w:t>Comment est organisée la formation chez vous aujourd'hui (interne, externe, plan de développement des compétences) ?</w:t>
+        <w:t>Combien de Sauveteurs Secouristes du Travail avez-vous aujourd'hui, et dans quels ateliers ?</w:t>
       </w:r>
     </w:p>
     <w:p>
@@ -717,15 +873,7 @@
         <w:pStyle w:val="ListBullet"/>
       </w:pPr>
       <w:r>
-        <w:t>Quels sont vos principaux enjeux RH cette année (recrutement, fidélisation, montée en compétences) ?</w:t>
-      </w:r>
-    </w:p>
-    <w:p>
-      <w:pPr>
-        <w:pStyle w:val="ListBullet"/>
-      </w:pPr>
-      <w:r>
-        <w:t>Sur quels métiers avez-vous le plus de tension ou de turn-over ?</w:t>
+        <w:t>Vos SST sont-ils à jour de leur recyclage (MAC tous les 24 mois) ? Qui suit les échéances ?</w:t>
       </w:r>
     </w:p>
     <w:p>
@@ -735,7 +883,7 @@
           <w:color w:val="B31B1B"/>
           <w:sz w:val="25"/>
         </w:rPr>
-        <w:t>Besoins</w:t>
+        <w:t>Risques physiques / TMS</w:t>
       </w:r>
     </w:p>
     <w:p>
@@ -743,7 +891,7 @@
         <w:pStyle w:val="ListBullet"/>
       </w:pPr>
       <w:r>
-        <w:t>Y a-t-il des compétences clés détenues par quelques experts que vous craignez de perdre (départs, retraites) ?</w:t>
+        <w:t>Avez-vous des postes avec port de charges ou gestes répétitifs ? Des arrêts liés au dos / TMS ?</w:t>
       </w:r>
     </w:p>
     <w:p>
@@ -751,23 +899,7 @@
         <w:pStyle w:val="ListBullet"/>
       </w:pPr>
       <w:r>
-        <w:t>Comment intégrez-vous et formez-vous vos nouveaux arrivants aujourd'hui ?</w:t>
-      </w:r>
-    </w:p>
-    <w:p>
-      <w:pPr>
-        <w:pStyle w:val="ListBullet"/>
-      </w:pPr>
-      <w:r>
-        <w:t>Vos managers de proximité sont-ils accompagnés/formés à l'encadrement ?</w:t>
-      </w:r>
-    </w:p>
-    <w:p>
-      <w:pPr>
-        <w:pStyle w:val="ListBullet"/>
-      </w:pPr>
-      <w:r>
-        <w:t>Où aimeriez-vous que vos équipes progressent en priorité dans les 12 prochains mois ?</w:t>
+        <w:t>Vos équipes ont-elles déjà été formées aux gestes et postures ou à la PRAP ?</w:t>
       </w:r>
     </w:p>
     <w:p>
@@ -777,7 +909,7 @@
           <w:color w:val="B31B1B"/>
           <w:sz w:val="25"/>
         </w:rPr>
-        <w:t>Impact &amp; décision</w:t>
+        <w:t>Incendie</w:t>
       </w:r>
     </w:p>
     <w:p>
@@ -785,7 +917,7 @@
         <w:pStyle w:val="ListBullet"/>
       </w:pPr>
       <w:r>
-        <w:t>Qu'est-ce que ça vous coûterait de ne rien faire sur ce sujet ?</w:t>
+        <w:t>Quand a eu lieu votre dernier exercice d'évacuation ? Avez-vous des équipiers de première intervention formés ?</w:t>
       </w:r>
     </w:p>
     <w:p>
@@ -793,7 +925,17 @@
         <w:pStyle w:val="ListBullet"/>
       </w:pPr>
       <w:r>
-        <w:t>Qui est impliqué dans le choix d'un organisme de formation ?</w:t>
+        <w:t>Votre personnel sait-il manipuler un extincteur ?</w:t>
+      </w:r>
+    </w:p>
+    <w:p>
+      <w:r>
+        <w:rPr>
+          <w:b/>
+          <w:color w:val="B31B1B"/>
+          <w:sz w:val="25"/>
+        </w:rPr>
+        <w:t>Cohésion &amp; contexte RH</w:t>
       </w:r>
     </w:p>
     <w:p>
@@ -801,7 +943,33 @@
         <w:pStyle w:val="ListBullet"/>
       </w:pPr>
       <w:r>
-        <w:t>Avez-vous un budget formation déjà engagé via votre OPCO pour cette année ?</w:t>
+        <w:t>Vous recrutez en ce moment : comment se passe l'intégration et la cohésion des équipes ?</w:t>
+      </w:r>
+    </w:p>
+    <w:p>
+      <w:pPr>
+        <w:pStyle w:val="ListBullet"/>
+      </w:pPr>
+      <w:r>
+        <w:t>Comment gérez-vous votre plan de formation sécurité aujourd'hui (interne, prestataires) ?</w:t>
+      </w:r>
+    </w:p>
+    <w:p>
+      <w:r>
+        <w:rPr>
+          <w:b/>
+          <w:color w:val="B31B1B"/>
+          <w:sz w:val="25"/>
+        </w:rPr>
+        <w:t>Décision / budget</w:t>
+      </w:r>
+    </w:p>
+    <w:p>
+      <w:pPr>
+        <w:pStyle w:val="ListBullet"/>
+      </w:pPr>
+      <w:r>
+        <w:t>Qui décide des formations sécurité ? Avez-vous un budget mobilisable via votre OPCO cette année ?</w:t>
       </w:r>
     </w:p>
     <w:p>
@@ -816,7 +984,22 @@
           <w:color w:val="1F3A5F"/>
           <w:sz w:val="32"/>
         </w:rPr>
-        <w:t>6. Vos arguments différenciants (sur-mesure &amp; local)</w:t>
+        <w:t>6. Vos arguments différenciants</w:t>
+      </w:r>
+    </w:p>
+    <w:p>
+      <w:pPr>
+        <w:pStyle w:val="ListBullet"/>
+      </w:pPr>
+      <w:r/>
+      <w:r>
+        <w:rPr>
+          <w:b/>
+        </w:rPr>
+        <w:t>Obligation = priorité</w:t>
+      </w:r>
+      <w:r>
+        <w:t xml:space="preserve"> : la sécurité n'est pas une option, c'est la loi — vous les aidez à être en règle.</w:t>
       </w:r>
     </w:p>
     <w:p>
@@ -831,7 +1014,7 @@
         <w:t>Sur-mesure</w:t>
       </w:r>
       <w:r>
-        <w:t xml:space="preserve"> : on ne vend pas un catalogue figé, on construit la formation à partir de VOS process, VOTRE vocabulaire métier, VOS cas concrets.</w:t>
+        <w:t xml:space="preserve"> : formations bâties sur LEURS postes réels (atelier de tressage, manutention de bobines, salle blanche).</w:t>
       </w:r>
     </w:p>
     <w:p>
@@ -843,10 +1026,10 @@
         <w:rPr>
           <w:b/>
         </w:rPr>
-        <w:t>Local / proximité</w:t>
+        <w:t>Local &amp; réactif</w:t>
       </w:r>
       <w:r>
-        <w:t xml:space="preserve"> : ancrage Hauts-de-France, intervenants qui se déplacent sur site, réactivité, relation humaine durable (en résonance avec leur ADN familial et territorial).</w:t>
+        <w:t xml:space="preserve"> : intervention sur site à Wervicq-Sud, planning calé sur la production, interlocuteur unique.</w:t>
       </w:r>
     </w:p>
     <w:p>
@@ -858,10 +1041,10 @@
         <w:rPr>
           <w:b/>
         </w:rPr>
-        <w:t>Andragogie</w:t>
+        <w:t>Approche globale</w:t>
       </w:r>
       <w:r>
-        <w:t xml:space="preserve"> : pédagogie pensée pour des adultes en activité — concret, opérationnel, applicable tout de suite.</w:t>
+        <w:t xml:space="preserve"> : un seul partenaire pour SST, gestes &amp; postures, PRAP, incendie ET cohésion.</w:t>
       </w:r>
     </w:p>
     <w:p>
@@ -873,10 +1056,10 @@
         <w:rPr>
           <w:b/>
         </w:rPr>
-        <w:t>Souplesse</w:t>
+        <w:t>Récurrence maîtrisée</w:t>
       </w:r>
       <w:r>
-        <w:t xml:space="preserve"> : formats courts, en présentiel sur site, adaptés aux contraintes de production.</w:t>
+        <w:t xml:space="preserve"> : suivi des recyclages MAC SST → vous ne ratez jamais une échéance.</w:t>
       </w:r>
     </w:p>
     <w:p>
@@ -888,7 +1071,7 @@
         <w:rPr>
           <w:b/>
         </w:rPr>
-        <w:t>Financement facilité</w:t>
+        <w:t>Financement</w:t>
       </w:r>
       <w:r>
         <w:t xml:space="preserve"> : [si Qualiopi] prise en charge possible via l'OPCO et le plan de développement des compétences.</w:t>
@@ -915,7 +1098,7 @@
           <w:b/>
           <w:color w:val="1F3A5F"/>
         </w:rPr>
-        <w:t>« On a déjà notre organisme de formation habituel. »</w:t>
+        <w:t>« On a déjà un organisme pour la sécurité. »</w:t>
       </w:r>
     </w:p>
     <w:p>
@@ -930,7 +1113,7 @@
         <w:t xml:space="preserve">→ Réponse : </w:t>
       </w:r>
       <w:r>
-        <w:t>« Très bien, ce n'est pas pour le remplacer. Justement, sur les besoins très spécifiques à vos métiers, le sur-mesure peut compléter ce qui existe. On peut commencer par un sujet précis. »</w:t>
+        <w:t>« Parfait, beaucoup de nos clients en ont un. On intervient souvent en complément, sur ce qui manque ou pour les recyclages. On peut commencer par un seul besoin, par exemple le MAC SST. »</w:t>
       </w:r>
     </w:p>
     <w:p>
@@ -939,7 +1122,7 @@
           <w:b/>
           <w:color w:val="1F3A5F"/>
         </w:rPr>
-        <w:t>« On n'a pas de budget en ce moment. »</w:t>
+        <w:t>« Nos salariés sont déjà formés. »</w:t>
       </w:r>
     </w:p>
     <w:p>
@@ -954,7 +1137,7 @@
         <w:t xml:space="preserve">→ Réponse : </w:t>
       </w:r>
       <w:r>
-        <w:t>« Je comprends. Beaucoup de nos formations sont finançables par votre OPCO via le plan de développement des compétences — on peut regarder ensemble ce qui est mobilisable. »</w:t>
+        <w:t>« Très bien. Et leurs recyclages sont-ils à jour ? Le SST se recycle tous les 2 ans. Je peux vous faire un point gratuit sur vos échéances. »</w:t>
       </w:r>
     </w:p>
     <w:p>
@@ -963,7 +1146,7 @@
           <w:b/>
           <w:color w:val="1F3A5F"/>
         </w:rPr>
-        <w:t>« On n'a pas le temps, on est en pleine production. »</w:t>
+        <w:t>« On n'a pas le temps, on est en production. »</w:t>
       </w:r>
     </w:p>
     <w:p>
@@ -978,7 +1161,7 @@
         <w:t xml:space="preserve">→ Réponse : </w:t>
       </w:r>
       <w:r>
-        <w:t>« C'est exactement pour ça qu'on construit du sur-mesure : formats courts, sur site, calés sur vos contraintes d'atelier, sans casser la production. »</w:t>
+        <w:t>« C'est pour ça qu'on vient sur site, en formats courts adaptés à vos horaires d'atelier, sans casser la production. »</w:t>
       </w:r>
     </w:p>
     <w:p>
@@ -987,7 +1170,7 @@
           <w:b/>
           <w:color w:val="1F3A5F"/>
         </w:rPr>
-        <w:t>« Envoyez-moi une plaquette, je regarderai. »</w:t>
+        <w:t>« C'est un budget en plus. »</w:t>
       </w:r>
     </w:p>
     <w:p>
@@ -1002,7 +1185,7 @@
         <w:t xml:space="preserve">→ Réponse : </w:t>
       </w:r>
       <w:r>
-        <w:t>« Avec plaisir, je vous l'envoie. Mais une plaquette générique ne dira rien de VOS besoins. Accordez-moi 30 minutes pour cadrer un ou deux sujets, et je reviens avec une proposition ciblée. »</w:t>
+        <w:t>« La plupart de ces formations sont finançables par votre OPCO. Et une formation prévention coûte bien moins cher qu'un accident, un arrêt de travail ou un contrôle. »</w:t>
       </w:r>
     </w:p>
     <w:p>
@@ -1011,7 +1194,7 @@
           <w:b/>
           <w:color w:val="1F3A5F"/>
         </w:rPr>
-        <w:t>« Pourquoi vous plutôt qu'un gros organisme national ? »</w:t>
+        <w:t>« Envoyez-moi une plaquette. »</w:t>
       </w:r>
     </w:p>
     <w:p>
@@ -1026,7 +1209,7 @@
         <w:t xml:space="preserve">→ Réponse : </w:t>
       </w:r>
       <w:r>
-        <w:t>« Parce qu'on est sur-mesure et local : on vient sur site, on parle votre métier, et vous avez un interlocuteur unique et réactif, pas un numéro de dossier. »</w:t>
+        <w:t>« Je vous l'envoie. Mais le plus utile serait 30 min pour faire le point sur vos obligations réelles, et je reviens avec une proposition ciblée. On se cale un créneau ? »</w:t>
       </w:r>
     </w:p>
     <w:p>
@@ -1041,7 +1224,7 @@
           <w:color w:val="1F3A5F"/>
           <w:sz w:val="32"/>
         </w:rPr>
-        <w:t>8. Financement (à maîtriser)</w:t>
+        <w:t>8. Financement (bon à savoir)</w:t>
       </w:r>
     </w:p>
     <w:p>
@@ -1056,7 +1239,22 @@
         <w:t>Qualiopi</w:t>
       </w:r>
       <w:r>
-        <w:t xml:space="preserve"> : certification qui ouvre les financements publics/mutualisés — mentionnez-la si vous l'avez.</w:t>
+        <w:t xml:space="preserve"> : à mentionner si vous l'avez — c'est ce qui ouvre les financements OPCO.</w:t>
+      </w:r>
+    </w:p>
+    <w:p>
+      <w:pPr>
+        <w:pStyle w:val="ListBullet"/>
+      </w:pPr>
+      <w:r/>
+      <w:r>
+        <w:rPr>
+          <w:b/>
+        </w:rPr>
+        <w:t>Habilitation INRS</w:t>
+      </w:r>
+      <w:r>
+        <w:t xml:space="preserve"> : pour SST/PRAP, valorisez votre habilitation (gage de sérieux) si vous l'avez.</w:t>
       </w:r>
     </w:p>
     <w:p>
@@ -1071,7 +1269,7 @@
         <w:t>OPCO</w:t>
       </w:r>
       <w:r>
-        <w:t xml:space="preserve"> : Cousin (textile technique / plasturgie / chimie) dépend a priori de l'</w:t>
+        <w:t xml:space="preserve"> : Cousin (industrie textile/plasturgie) dépend a priori de l'</w:t>
       </w:r>
       <w:r>
         <w:rPr>
@@ -1080,7 +1278,7 @@
         <w:t>OPCO 2i</w:t>
       </w:r>
       <w:r>
-        <w:t xml:space="preserve"> (industrie) — à confirmer ; c'est lui qui peut financer le plan de développement des compétences.</w:t>
+        <w:t xml:space="preserve"> — à confirmer.</w:t>
       </w:r>
     </w:p>
     <w:p>
@@ -1095,15 +1293,7 @@
         <w:t>Plan de développement des compétences</w:t>
       </w:r>
       <w:r>
-        <w:t xml:space="preserve"> : le levier principal côté entreprise.</w:t>
-      </w:r>
-    </w:p>
-    <w:p>
-      <w:pPr>
-        <w:pStyle w:val="ListBullet"/>
-      </w:pPr>
-      <w:r>
-        <w:t>Objectif : montrer que le frein budgétaire est souvent surmontable.</w:t>
+        <w:t xml:space="preserve"> : le canal de financement côté entreprise.</w:t>
       </w:r>
     </w:p>
     <w:p>
@@ -1124,14 +1314,6 @@
     <w:p>
       <w:r>
         <w:rPr>
-          <w:b w:val="0"/>
-        </w:rPr>
-        <w:t>Ne jamais raccrocher sans une étape suivante datée.</w:t>
-      </w:r>
-    </w:p>
-    <w:p>
-      <w:r>
-        <w:rPr>
           <w:b/>
           <w:color w:val="B31B1B"/>
         </w:rPr>
@@ -1141,7 +1323,7 @@
         <w:rPr>
           <w:i/>
         </w:rPr>
-        <w:t>« Ce que je vous propose : un rendez-vous de 30–45 min, sur site ou en visio, pour cadrer 1 ou 2 sujets prioritaires. Je reviens ensuite avec une proposition sur-mesure et chiffrée. »</w:t>
+        <w:t>« Ce que je vous propose : un point de 30 min, sur site ou en visio, pour faire l'état de vos obligations (SST, évacuation, TMS) et vos échéances de recyclage. Je reviens avec un plan et un devis sur-mesure. »</w:t>
       </w:r>
     </w:p>
     <w:p>
@@ -1158,7 +1340,7 @@
         <w:t>2 créneaux précis</w:t>
       </w:r>
       <w:r>
-        <w:t xml:space="preserve"> plutôt qu'un vague « quand vous voulez ».</w:t>
+        <w:t>.</w:t>
       </w:r>
     </w:p>
     <w:p>
@@ -1166,7 +1348,7 @@
         <w:pStyle w:val="ListBullet"/>
       </w:pPr>
       <w:r>
-        <w:t>Validez : interlocuteur, email, prochain RDV, ce que vous envoyez d'ici là.</w:t>
+        <w:t>Validez : interlocuteur, email, prochaine étape, ce que vous envoyez d'ici là.</w:t>
       </w:r>
     </w:p>
     <w:p>
@@ -1174,7 +1356,7 @@
         <w:pStyle w:val="ListBullet"/>
       </w:pPr>
       <w:r>
-        <w:t>Reformulez les besoins entendus avant de raccrocher (« si j'ai bien compris, vos priorités sont… »).</w:t>
+        <w:t>Reformulez les besoins entendus avant de raccrocher.</w:t>
       </w:r>
     </w:p>
     <w:p>
@@ -1205,7 +1387,7 @@
         <w:pStyle w:val="ListBullet"/>
       </w:pPr>
       <w:r>
-        <w:t>Mes 2-3 offres phares et un exemple de réussite client prêts à citer.</w:t>
+        <w:t>Mes tarifs/durées par formation + 1 exemple de client industriel satisfait.</w:t>
       </w:r>
     </w:p>
     <w:p>
@@ -1213,7 +1395,7 @@
         <w:pStyle w:val="ListBullet"/>
       </w:pPr>
       <w:r>
-        <w:t>Mes créneaux de RDV de cadrage disponibles.</w:t>
+        <w:t>Mes créneaux de RDV disponibles.</w:t>
       </w:r>
     </w:p>
     <w:p>
@@ -1221,15 +1403,7 @@
         <w:pStyle w:val="ListBullet"/>
       </w:pPr>
       <w:r>
-        <w:t>Endroit calme, bon réseau, écouteurs, eau, sourire (s'entend au téléphone).</w:t>
-      </w:r>
-    </w:p>
-    <w:p>
-      <w:pPr>
-        <w:pStyle w:val="ListBullet"/>
-      </w:pPr>
-      <w:r>
-        <w:t>De quoi noter : besoins exprimés, budget, décideurs, prochaine étape.</w:t>
+        <w:t>Endroit calme, bon réseau, de quoi noter, sourire (s'entend au téléphone).</w:t>
       </w:r>
     </w:p>
     <w:p>
@@ -1265,7 +1439,20 @@
         <w:rPr>
           <w:b w:val="0"/>
         </w:rPr>
-        <w:t>Besoins exprimés :</w:t>
+        <w:t>Nb de SST actuels / échéances recyclage :</w:t>
+      </w:r>
+    </w:p>
+    <w:p>
+      <w:r>
+        <w:t>……………………………………………………………………………………………………</w:t>
+      </w:r>
+    </w:p>
+    <w:p>
+      <w:r>
+        <w:rPr>
+          <w:b w:val="0"/>
+        </w:rPr>
+        <w:t>Besoins exprimés (gestes/PRAP, incendie, cohésion) :</w:t>
       </w:r>
     </w:p>
     <w:p>
@@ -1288,20 +1475,7 @@
         <w:rPr>
           <w:b w:val="0"/>
         </w:rPr>
-        <w:t>Budget / OPCO :</w:t>
-      </w:r>
-    </w:p>
-    <w:p>
-      <w:r>
-        <w:t>……………………………………………………………………………………………………</w:t>
-      </w:r>
-    </w:p>
-    <w:p>
-      <w:r>
-        <w:rPr>
-          <w:b w:val="0"/>
-        </w:rPr>
-        <w:t>Décideurs impliqués :</w:t>
+        <w:t>Budget / OPCO / décideurs :</w:t>
       </w:r>
     </w:p>
     <w:p>

</xml_diff>